<commit_message>
Update resume + Update experience info
</commit_message>
<xml_diff>
--- a/client/public/resume.docx
+++ b/client/public/resume.docx
@@ -49,7 +49,7 @@
         </w:rPr>
         <w:t xml:space="preserve"> </w:t>
       </w:r>
-      <w:hyperlink r:id="rId7">
+      <w:hyperlink r:id="rId6">
         <w:r>
           <w:rPr>
             <w:b w:val="1"/>
@@ -71,7 +71,7 @@
         </w:rPr>
         <w:t xml:space="preserve"> | </w:t>
       </w:r>
-      <w:hyperlink r:id="rId8">
+      <w:hyperlink r:id="rId7">
         <w:r>
           <w:rPr>
             <w:b w:val="1"/>
@@ -93,7 +93,7 @@
         </w:rPr>
         <w:t xml:space="preserve"> | </w:t>
       </w:r>
-      <w:hyperlink r:id="rId9">
+      <w:hyperlink r:id="rId8">
         <w:r>
           <w:rPr>
             <w:b w:val="1"/>
@@ -257,7 +257,7 @@
           <w:szCs w:val="20"/>
           <w:rtl w:val="0"/>
         </w:rPr>
-        <w:t xml:space="preserve">JavaScript, Node.js, Express.js, MongoDB, PostgreSQL, Redis.</w:t>
+        <w:t xml:space="preserve">JavaScript, Node.js, Express.js, MongoDB, PostgreSQL.</w:t>
       </w:r>
     </w:p>
     <w:p>
@@ -363,6 +363,140 @@
         <w:rPr>
           <w:rtl w:val="0"/>
         </w:rPr>
+      </w:r>
+    </w:p>
+    <w:p>
+      <w:pPr>
+        <w:widowControl w:val="0"/>
+        <w:tabs>
+          <w:tab w:val="right" w:leader="none" w:pos="11088"/>
+          <w:tab w:val="right" w:leader="none" w:pos="11430"/>
+        </w:tabs>
+        <w:spacing w:line="252.00000000000003" w:lineRule="auto"/>
+        <w:rPr>
+          <w:b w:val="1"/>
+          <w:bCs w:val="1"/>
+          <w:sz w:val="20"/>
+          <w:szCs w:val="20"/>
+        </w:rPr>
+      </w:pPr>
+      <w:r>
+        <w:rPr>
+          <w:b w:val="1"/>
+          <w:bCs w:val="1"/>
+          <w:sz w:val="20"/>
+          <w:szCs w:val="20"/>
+          <w:rtl w:val="0"/>
+        </w:rPr>
+        <w:t xml:space="preserve">Full Stack Developer at Wolke Consultancy - Internship</w:t>
+      </w:r>
+      <w:r>
+        <w:rPr>
+          <w:sz w:val="20"/>
+          <w:szCs w:val="20"/>
+          <w:rtl w:val="0"/>
+        </w:rPr>
+        <w:tab/>
+      </w:r>
+      <w:r>
+        <w:rPr>
+          <w:b w:val="1"/>
+          <w:bCs w:val="1"/>
+          <w:sz w:val="20"/>
+          <w:szCs w:val="20"/>
+          <w:rtl w:val="0"/>
+        </w:rPr>
+        <w:t xml:space="preserve">Dec 2025 – Mar 2026</w:t>
+      </w:r>
+    </w:p>
+    <w:p>
+      <w:pPr>
+        <w:widowControl w:val="0"/>
+        <w:numPr>
+          <w:ilvl w:val="0"/>
+          <w:numId w:val="2"/>
+        </w:numPr>
+        <w:tabs>
+          <w:tab w:val="right" w:leader="none" w:pos="11088"/>
+        </w:tabs>
+        <w:spacing w:after="0" w:line="252.00000000000003" w:lineRule="auto"/>
+        <w:ind w:left="720" w:hanging="360"/>
+        <w:rPr>
+          <w:rFonts w:ascii="Noto Sans Symbols" w:cs="Noto Sans Symbols" w:eastAsia="Noto Sans Symbols" w:hAnsi="Noto Sans Symbols"/>
+          <w:sz w:val="20"/>
+          <w:szCs w:val="20"/>
+        </w:rPr>
+      </w:pPr>
+      <w:r>
+        <w:rPr>
+          <w:sz w:val="20"/>
+          <w:szCs w:val="20"/>
+          <w:rtl w:val="0"/>
+        </w:rPr>
+        <w:t xml:space="preserve">Developed, Maintained and deployed full stack web applications using </w:t>
+      </w:r>
+      <w:r>
+        <w:rPr>
+          <w:b w:val="1"/>
+          <w:bCs w:val="1"/>
+          <w:sz w:val="20"/>
+          <w:szCs w:val="20"/>
+          <w:rtl w:val="0"/>
+        </w:rPr>
+        <w:t xml:space="preserve">MERN</w:t>
+      </w:r>
+      <w:r>
+        <w:rPr>
+          <w:sz w:val="20"/>
+          <w:szCs w:val="20"/>
+          <w:rtl w:val="0"/>
+        </w:rPr>
+        <w:t xml:space="preserve"> and </w:t>
+      </w:r>
+      <w:r>
+        <w:rPr>
+          <w:b w:val="1"/>
+          <w:bCs w:val="1"/>
+          <w:sz w:val="20"/>
+          <w:szCs w:val="20"/>
+          <w:rtl w:val="0"/>
+        </w:rPr>
+        <w:t xml:space="preserve">PERN</w:t>
+      </w:r>
+      <w:r>
+        <w:rPr>
+          <w:sz w:val="20"/>
+          <w:szCs w:val="20"/>
+          <w:rtl w:val="0"/>
+        </w:rPr>
+        <w:t xml:space="preserve"> stacks, including REST APIs, React frontends, and database integration.</w:t>
+      </w:r>
+    </w:p>
+    <w:p>
+      <w:pPr>
+        <w:widowControl w:val="0"/>
+        <w:numPr>
+          <w:ilvl w:val="0"/>
+          <w:numId w:val="2"/>
+        </w:numPr>
+        <w:tabs>
+          <w:tab w:val="right" w:leader="none" w:pos="11088"/>
+        </w:tabs>
+        <w:spacing w:after="0" w:line="252.00000000000003" w:lineRule="auto"/>
+        <w:ind w:left="720" w:hanging="360"/>
+        <w:rPr>
+          <w:sz w:val="20"/>
+          <w:szCs w:val="20"/>
+          <w:u w:val="none"/>
+        </w:rPr>
+      </w:pPr>
+      <w:r>
+        <w:rPr>
+          <w:sz w:val="20"/>
+          <w:szCs w:val="20"/>
+          <w:rtl w:val="0"/>
+        </w:rPr>
+        <w:t xml:space="preserve">Collaborated using Git/GitHub for version control, participated in daily stand ups, and delivered features on schedule for client projects.</w:t>
       </w:r>
     </w:p>
     <w:p>
@@ -381,21 +515,19 @@
         </w:tabs>
         <w:spacing w:line="252.00000000000003" w:lineRule="auto"/>
         <w:rPr>
-          <w:b w:val="1"/>
-          <w:bCs w:val="1"/>
-          <w:sz w:val="20"/>
-          <w:szCs w:val="20"/>
-        </w:rPr>
-      </w:pPr>
-      <w:r>
-        <w:rPr>
-          <w:b w:val="1"/>
-          <w:bCs w:val="1"/>
-          <w:sz w:val="20"/>
-          <w:szCs w:val="20"/>
-          <w:rtl w:val="0"/>
-        </w:rPr>
-        <w:t xml:space="preserve">Freelance Front-End Developer</w:t>
+          <w:sz w:val="20"/>
+          <w:szCs w:val="20"/>
+        </w:rPr>
+      </w:pPr>
+      <w:r>
+        <w:rPr>
+          <w:b w:val="1"/>
+          <w:bCs w:val="1"/>
+          <w:sz w:val="20"/>
+          <w:szCs w:val="20"/>
+          <w:rtl w:val="0"/>
+        </w:rPr>
+        <w:t xml:space="preserve">Junior Software Engineer at Wolke Consultancy - Full Time</w:t>
       </w:r>
       <w:r>
         <w:rPr>
@@ -414,7 +546,7 @@
           <w:szCs w:val="20"/>
           <w:rtl w:val="0"/>
         </w:rPr>
-        <w:t xml:space="preserve">Sep</w:t>
+        <w:t xml:space="preserve">Mar</w:t>
       </w:r>
       <w:r>
         <w:rPr>
@@ -425,7 +557,28 @@
           <w:szCs w:val="20"/>
           <w:rtl w:val="0"/>
         </w:rPr>
-        <w:t xml:space="preserve"> 2025 – </w:t>
+        <w:t xml:space="preserve"> 202</w:t>
+      </w:r>
+      <w:r>
+        <w:rPr>
+          <w:b w:val="1"/>
+          <w:bCs w:val="1"/>
+          <w:sz w:val="20"/>
+          <w:szCs w:val="20"/>
+          <w:rtl w:val="0"/>
+        </w:rPr>
+        <w:t xml:space="preserve">6</w:t>
+      </w:r>
+      <w:r>
+        <w:rPr>
+          <w:b w:val="1"/>
+          <w:bCs w:val="1"/>
+          <w:color w:val="000000"/>
+          <w:sz w:val="20"/>
+          <w:szCs w:val="20"/>
+          <w:rtl w:val="0"/>
+        </w:rPr>
+        <w:t xml:space="preserve"> – </w:t>
       </w:r>
       <w:r>
         <w:rPr>
@@ -436,6 +589,11 @@
           <w:rtl w:val="0"/>
         </w:rPr>
         <w:t xml:space="preserve">Present</w:t>
+      </w:r>
+      <w:r>
+        <w:rPr>
+          <w:rtl w:val="0"/>
+        </w:rPr>
       </w:r>
     </w:p>
     <w:p>
@@ -443,7 +601,7 @@
         <w:widowControl w:val="0"/>
         <w:numPr>
           <w:ilvl w:val="0"/>
-          <w:numId w:val="3"/>
+          <w:numId w:val="2"/>
         </w:numPr>
         <w:tabs>
           <w:tab w:val="right" w:leader="none" w:pos="11088"/>
@@ -451,18 +609,71 @@
         <w:spacing w:after="0" w:line="252.00000000000003" w:lineRule="auto"/>
         <w:ind w:left="720" w:hanging="360"/>
         <w:rPr>
-          <w:rFonts w:ascii="Noto Sans Symbols" w:cs="Noto Sans Symbols" w:eastAsia="Noto Sans Symbols" w:hAnsi="Noto Sans Symbols"/>
-          <w:sz w:val="20"/>
-          <w:szCs w:val="20"/>
-        </w:rPr>
-      </w:pPr>
-      <w:r>
-        <w:rPr>
-          <w:sz w:val="20"/>
-          <w:szCs w:val="20"/>
-          <w:rtl w:val="0"/>
-        </w:rPr>
-        <w:t xml:space="preserve">Provided freelance front-end development services, focusing on creating responsive, sleek design and user friendly web interfaces using React, Next.js, TypeScript and Tailwind CSS with different UI component libraries.</w:t>
+          <w:sz w:val="20"/>
+          <w:szCs w:val="20"/>
+          <w:u w:val="none"/>
+        </w:rPr>
+      </w:pPr>
+      <w:r>
+        <w:rPr>
+          <w:sz w:val="20"/>
+          <w:szCs w:val="20"/>
+          <w:rtl w:val="0"/>
+        </w:rPr>
+        <w:t xml:space="preserve">Promoted from Intern to Junior Software Engineer within 2 months due to consistent delivery of high quality code and proactive problem solving.</w:t>
+      </w:r>
+    </w:p>
+    <w:p>
+      <w:pPr>
+        <w:widowControl w:val="0"/>
+        <w:numPr>
+          <w:ilvl w:val="0"/>
+          <w:numId w:val="2"/>
+        </w:numPr>
+        <w:tabs>
+          <w:tab w:val="right" w:leader="none" w:pos="11088"/>
+        </w:tabs>
+        <w:spacing w:after="0" w:line="252.00000000000003" w:lineRule="auto"/>
+        <w:ind w:left="720" w:hanging="360"/>
+        <w:rPr>
+          <w:sz w:val="20"/>
+          <w:szCs w:val="20"/>
+        </w:rPr>
+      </w:pPr>
+      <w:r>
+        <w:rPr>
+          <w:sz w:val="20"/>
+          <w:szCs w:val="20"/>
+          <w:rtl w:val="0"/>
+        </w:rPr>
+        <w:t xml:space="preserve">Took end‑to‑end ownership of 3 software products, from requirements gathering to cloud deployment.</w:t>
+      </w:r>
+    </w:p>
+    <w:p>
+      <w:pPr>
+        <w:widowControl w:val="0"/>
+        <w:numPr>
+          <w:ilvl w:val="0"/>
+          <w:numId w:val="2"/>
+        </w:numPr>
+        <w:tabs>
+          <w:tab w:val="right" w:leader="none" w:pos="11088"/>
+        </w:tabs>
+        <w:spacing w:after="0" w:line="252.00000000000003" w:lineRule="auto"/>
+        <w:ind w:left="720" w:hanging="360"/>
+        <w:rPr>
+          <w:sz w:val="20"/>
+          <w:szCs w:val="20"/>
+          <w:u w:val="none"/>
+        </w:rPr>
+      </w:pPr>
+      <w:r>
+        <w:rPr>
+          <w:sz w:val="20"/>
+          <w:szCs w:val="20"/>
+          <w:rtl w:val="0"/>
+        </w:rPr>
+        <w:t xml:space="preserve">Conducted code reviews, enforced best practices, and reduced bug recurrence.</w:t>
       </w:r>
       <w:r>
         <w:rPr>
@@ -522,7 +733,7 @@
           <w:szCs w:val="20"/>
         </w:rPr>
       </w:pPr>
-      <w:hyperlink r:id="rId10">
+      <w:hyperlink r:id="rId9">
         <w:r>
           <w:rPr>
             <w:b w:val="1"/>
@@ -567,7 +778,7 @@
         <w:widowControl w:val="0"/>
         <w:numPr>
           <w:ilvl w:val="0"/>
-          <w:numId w:val="4"/>
+          <w:numId w:val="3"/>
         </w:numPr>
         <w:pBdr>
           <w:top w:space="0" w:sz="0" w:val="nil"/>
@@ -637,7 +848,7 @@
         <w:widowControl w:val="0"/>
         <w:numPr>
           <w:ilvl w:val="0"/>
-          <w:numId w:val="4"/>
+          <w:numId w:val="3"/>
         </w:numPr>
         <w:pBdr>
           <w:top w:space="0" w:sz="0" w:val="nil"/>
@@ -655,8 +866,6 @@
         <w:ind w:left="720" w:right="0" w:hanging="360"/>
         <w:jc w:val="left"/>
         <w:rPr>
-          <w:sz w:val="20"/>
-          <w:szCs w:val="20"/>
           <w:u w:val="none"/>
         </w:rPr>
       </w:pPr>
@@ -718,7 +927,7 @@
         <w:widowControl w:val="0"/>
         <w:numPr>
           <w:ilvl w:val="0"/>
-          <w:numId w:val="4"/>
+          <w:numId w:val="3"/>
         </w:numPr>
         <w:pBdr>
           <w:top w:space="0" w:sz="0" w:val="nil"/>
@@ -736,8 +945,6 @@
         <w:ind w:left="720" w:right="0" w:hanging="360"/>
         <w:jc w:val="left"/>
         <w:rPr>
-          <w:sz w:val="20"/>
-          <w:szCs w:val="20"/>
           <w:u w:val="none"/>
         </w:rPr>
       </w:pPr>
@@ -807,7 +1014,7 @@
           <w:szCs w:val="20"/>
         </w:rPr>
       </w:pPr>
-      <w:hyperlink r:id="rId11">
+      <w:hyperlink r:id="rId10">
         <w:r>
           <w:rPr>
             <w:b w:val="1"/>
@@ -851,7 +1058,7 @@
         <w:widowControl w:val="0"/>
         <w:numPr>
           <w:ilvl w:val="0"/>
-          <w:numId w:val="4"/>
+          <w:numId w:val="3"/>
         </w:numPr>
         <w:pBdr>
           <w:top w:space="0" w:sz="0" w:val="nil"/>
@@ -1066,7 +1273,7 @@
         <w:widowControl w:val="0"/>
         <w:numPr>
           <w:ilvl w:val="0"/>
-          <w:numId w:val="4"/>
+          <w:numId w:val="3"/>
         </w:numPr>
         <w:pBdr>
           <w:top w:space="0" w:sz="0" w:val="nil"/>
@@ -1085,8 +1292,6 @@
         <w:ind w:left="720" w:right="0" w:hanging="360"/>
         <w:jc w:val="left"/>
         <w:rPr>
-          <w:sz w:val="20"/>
-          <w:szCs w:val="20"/>
           <w:u w:val="none"/>
         </w:rPr>
       </w:pPr>
@@ -1148,7 +1353,7 @@
         <w:widowControl w:val="0"/>
         <w:numPr>
           <w:ilvl w:val="0"/>
-          <w:numId w:val="4"/>
+          <w:numId w:val="3"/>
         </w:numPr>
         <w:pBdr>
           <w:top w:space="0" w:sz="0" w:val="nil"/>
@@ -1167,8 +1372,6 @@
         <w:ind w:left="720" w:right="0" w:hanging="360"/>
         <w:jc w:val="left"/>
         <w:rPr>
-          <w:sz w:val="20"/>
-          <w:szCs w:val="20"/>
           <w:u w:val="none"/>
         </w:rPr>
       </w:pPr>
@@ -1178,7 +1381,7 @@
           <w:szCs w:val="20"/>
           <w:rtl w:val="0"/>
         </w:rPr>
-        <w:t xml:space="preserve">Built real time messaging with support for text, images, and video sharing, ensuring low latency delivery through optimized </w:t>
+        <w:t xml:space="preserve">Built real time messaging with support for text and images, ensuring low latency delivery through optimized </w:t>
       </w:r>
       <w:r>
         <w:rPr>
@@ -1219,7 +1422,7 @@
           <w:szCs w:val="20"/>
         </w:rPr>
       </w:pPr>
-      <w:hyperlink r:id="rId12">
+      <w:hyperlink r:id="rId11">
         <w:r>
           <w:rPr>
             <w:b w:val="1"/>
@@ -1257,7 +1460,7 @@
         <w:widowControl w:val="0"/>
         <w:numPr>
           <w:ilvl w:val="0"/>
-          <w:numId w:val="2"/>
+          <w:numId w:val="1"/>
         </w:numPr>
         <w:tabs>
           <w:tab w:val="right" w:leader="none" w:pos="11088"/>
@@ -1343,27 +1546,7 @@
           <w:szCs w:val="20"/>
           <w:rtl w:val="0"/>
         </w:rPr>
-        <w:t xml:space="preserve">Next.js, Tailwind CSS, and </w:t>
-      </w:r>
-      <w:r>
-        <w:rPr>
-          <w:b w:val="1"/>
-          <w:bCs w:val="1"/>
-          <w:sz w:val="20"/>
-          <w:szCs w:val="20"/>
-          <w:rtl w:val="0"/>
-        </w:rPr>
-        <w:t xml:space="preserve">Shadcn</w:t>
-      </w:r>
-      <w:r>
-        <w:rPr>
-          <w:b w:val="1"/>
-          <w:bCs w:val="1"/>
-          <w:sz w:val="20"/>
-          <w:szCs w:val="20"/>
-          <w:rtl w:val="0"/>
-        </w:rPr>
-        <w:t xml:space="preserve"> UI</w:t>
+        <w:t xml:space="preserve">Next.js, Tailwind CSS, and Shadcn UI</w:t>
       </w:r>
       <w:r>
         <w:rPr>
@@ -1377,196 +1560,6 @@
         <w:rPr>
           <w:rtl w:val="0"/>
         </w:rPr>
-      </w:r>
-    </w:p>
-    <w:p>
-      <w:pPr>
-        <w:widowControl w:val="0"/>
-        <w:numPr>
-          <w:ilvl w:val="0"/>
-          <w:numId w:val="2"/>
-        </w:numPr>
-        <w:tabs>
-          <w:tab w:val="right" w:leader="none" w:pos="11088"/>
-          <w:tab w:val="right" w:leader="none" w:pos="11232"/>
-          <w:tab w:val="right" w:leader="none" w:pos="11430"/>
-        </w:tabs>
-        <w:spacing w:after="0" w:line="252.00000000000003" w:lineRule="auto"/>
-        <w:ind w:left="720" w:hanging="360"/>
-        <w:rPr>
-          <w:sz w:val="20"/>
-          <w:szCs w:val="20"/>
-          <w:u w:val="none"/>
-        </w:rPr>
-      </w:pPr>
-      <w:r>
-        <w:rPr>
-          <w:sz w:val="20"/>
-          <w:szCs w:val="20"/>
-          <w:rtl w:val="0"/>
-        </w:rPr>
-        <w:t xml:space="preserve">Implemented a </w:t>
-      </w:r>
-      <w:r>
-        <w:rPr>
-          <w:b w:val="1"/>
-          <w:bCs w:val="1"/>
-          <w:sz w:val="20"/>
-          <w:szCs w:val="20"/>
-          <w:rtl w:val="0"/>
-        </w:rPr>
-        <w:t xml:space="preserve">component</w:t>
-      </w:r>
-      <w:r>
-        <w:rPr>
-          <w:sz w:val="20"/>
-          <w:szCs w:val="20"/>
-          <w:rtl w:val="0"/>
-        </w:rPr>
-        <w:t xml:space="preserve"> driven architecture with reusable UI components, ensuring consistency, accessibility, and maintainable code.</w:t>
-      </w:r>
-      <w:r>
-        <w:rPr>
-          <w:rtl w:val="0"/>
-        </w:rPr>
-      </w:r>
-    </w:p>
-    <w:p>
-      <w:pPr>
-        <w:widowControl w:val="0"/>
-        <w:numPr>
-          <w:ilvl w:val="0"/>
-          <w:numId w:val="2"/>
-        </w:numPr>
-        <w:tabs>
-          <w:tab w:val="right" w:leader="none" w:pos="11088"/>
-          <w:tab w:val="right" w:leader="none" w:pos="11232"/>
-          <w:tab w:val="right" w:leader="none" w:pos="11430"/>
-        </w:tabs>
-        <w:spacing w:after="0" w:line="252.00000000000003" w:lineRule="auto"/>
-        <w:ind w:left="720" w:hanging="360"/>
-        <w:rPr>
-          <w:sz w:val="20"/>
-          <w:szCs w:val="20"/>
-          <w:u w:val="none"/>
-        </w:rPr>
-      </w:pPr>
-      <w:r>
-        <w:rPr>
-          <w:sz w:val="20"/>
-          <w:szCs w:val="20"/>
-          <w:rtl w:val="0"/>
-        </w:rPr>
-        <w:t xml:space="preserve">Built </w:t>
-      </w:r>
-      <w:r>
-        <w:rPr>
-          <w:b w:val="1"/>
-          <w:bCs w:val="1"/>
-          <w:sz w:val="20"/>
-          <w:szCs w:val="20"/>
-          <w:rtl w:val="0"/>
-        </w:rPr>
-        <w:t xml:space="preserve">mobile first</w:t>
-      </w:r>
-      <w:r>
-        <w:rPr>
-          <w:sz w:val="20"/>
-          <w:szCs w:val="20"/>
-          <w:rtl w:val="0"/>
-        </w:rPr>
-        <w:t xml:space="preserve"> layouts to ensure seamless performance across devices and </w:t>
-      </w:r>
-      <w:r>
-        <w:rPr>
-          <w:b w:val="1"/>
-          <w:bCs w:val="1"/>
-          <w:sz w:val="20"/>
-          <w:szCs w:val="20"/>
-          <w:rtl w:val="0"/>
-        </w:rPr>
-        <w:t xml:space="preserve">Collaborated</w:t>
-      </w:r>
-      <w:r>
-        <w:rPr>
-          <w:sz w:val="20"/>
-          <w:szCs w:val="20"/>
-          <w:rtl w:val="0"/>
-        </w:rPr>
-        <w:t xml:space="preserve"> with the client to translate creative requirements into functional UI, iterating based on feedback to deliver a polished final product.</w:t>
-      </w:r>
-      <w:r>
-        <w:rPr>
-          <w:rtl w:val="0"/>
-        </w:rPr>
-      </w:r>
-    </w:p>
-    <w:p>
-      <w:pPr>
-        <w:widowControl w:val="0"/>
-        <w:tabs>
-          <w:tab w:val="right" w:leader="none" w:pos="11088"/>
-          <w:tab w:val="right" w:leader="none" w:pos="11232"/>
-          <w:tab w:val="right" w:leader="none" w:pos="11430"/>
-        </w:tabs>
-        <w:spacing w:after="0" w:line="252.00000000000003" w:lineRule="auto"/>
-        <w:ind w:left="0" w:firstLine="0"/>
-        <w:rPr>
-          <w:b w:val="1"/>
-          <w:bCs w:val="1"/>
-          <w:sz w:val="20"/>
-          <w:szCs w:val="20"/>
-        </w:rPr>
-      </w:pPr>
-      <w:hyperlink r:id="rId13">
-        <w:r>
-          <w:rPr>
-            <w:b w:val="1"/>
-            <w:bCs w:val="1"/>
-            <w:color w:val="1155cc"/>
-            <w:sz w:val="20"/>
-            <w:szCs w:val="20"/>
-            <w:u w:val="single"/>
-            <w:rtl w:val="0"/>
-          </w:rPr>
-          <w:t xml:space="preserve">ARCH LINUX AUTOMATION</w:t>
-        </w:r>
-      </w:hyperlink>
-      <w:r>
-        <w:rPr>
-          <w:sz w:val="20"/>
-          <w:szCs w:val="20"/>
-          <w:rtl w:val="0"/>
-        </w:rPr>
-        <w:t xml:space="preserve"> - </w:t>
-      </w:r>
-      <w:r>
-        <w:rPr>
-          <w:b w:val="1"/>
-          <w:bCs w:val="1"/>
-          <w:sz w:val="20"/>
-          <w:szCs w:val="20"/>
-          <w:rtl w:val="0"/>
-        </w:rPr>
-        <w:t xml:space="preserve">Bash</w:t>
-      </w:r>
-      <w:r>
-        <w:rPr>
-          <w:sz w:val="20"/>
-          <w:szCs w:val="20"/>
-          <w:rtl w:val="0"/>
-        </w:rPr>
-        <w:t xml:space="preserve"> </w:t>
-      </w:r>
-      <w:r>
-        <w:rPr>
-          <w:b w:val="1"/>
-          <w:bCs w:val="1"/>
-          <w:sz w:val="20"/>
-          <w:szCs w:val="20"/>
-          <w:rtl w:val="0"/>
-        </w:rPr>
-        <w:t xml:space="preserve">Scripts</w:t>
       </w:r>
     </w:p>
     <w:p>
@@ -1584,8 +1577,6 @@
         <w:spacing w:after="0" w:line="252.00000000000003" w:lineRule="auto"/>
         <w:ind w:left="720" w:hanging="360"/>
         <w:rPr>
-          <w:b w:val="1"/>
-          <w:bCs w:val="1"/>
           <w:sz w:val="20"/>
           <w:szCs w:val="20"/>
         </w:rPr>
@@ -1606,129 +1597,33 @@
           <w:szCs w:val="20"/>
           <w:rtl w:val="0"/>
         </w:rPr>
-        <w:t xml:space="preserve">Bash</w:t>
-      </w:r>
-      <w:r>
-        <w:rPr>
-          <w:sz w:val="20"/>
-          <w:szCs w:val="20"/>
-          <w:rtl w:val="0"/>
-        </w:rPr>
-        <w:t xml:space="preserve"> automation scripts to provision an </w:t>
-      </w:r>
-      <w:r>
-        <w:rPr>
-          <w:b w:val="1"/>
-          <w:bCs w:val="1"/>
-          <w:sz w:val="20"/>
-          <w:szCs w:val="20"/>
-          <w:rtl w:val="0"/>
-        </w:rPr>
-        <w:t xml:space="preserve">Arch Linux</w:t>
-      </w:r>
-      <w:r>
-        <w:rPr>
-          <w:sz w:val="20"/>
-          <w:szCs w:val="20"/>
-          <w:rtl w:val="0"/>
-        </w:rPr>
-        <w:t xml:space="preserve"> dev environment using pacman, yay, and systemd.</w:t>
-      </w:r>
-      <w:r>
-        <w:rPr>
-          <w:rtl w:val="0"/>
-        </w:rPr>
-      </w:r>
-    </w:p>
-    <w:p>
-      <w:pPr>
-        <w:widowControl w:val="0"/>
-        <w:numPr>
-          <w:ilvl w:val="0"/>
-          <w:numId w:val="1"/>
-        </w:numPr>
-        <w:tabs>
-          <w:tab w:val="right" w:leader="none" w:pos="11088"/>
-          <w:tab w:val="right" w:leader="none" w:pos="11232"/>
-          <w:tab w:val="right" w:leader="none" w:pos="11430"/>
-        </w:tabs>
-        <w:spacing w:after="0" w:line="252.00000000000003" w:lineRule="auto"/>
-        <w:ind w:left="720" w:hanging="360"/>
-        <w:rPr>
-          <w:sz w:val="20"/>
-          <w:szCs w:val="20"/>
-          <w:u w:val="none"/>
-        </w:rPr>
-      </w:pPr>
-      <w:r>
-        <w:rPr>
-          <w:b w:val="1"/>
-          <w:bCs w:val="1"/>
-          <w:sz w:val="20"/>
-          <w:szCs w:val="20"/>
-          <w:rtl w:val="0"/>
-        </w:rPr>
-        <w:t xml:space="preserve">Automated</w:t>
-      </w:r>
-      <w:r>
-        <w:rPr>
-          <w:sz w:val="20"/>
-          <w:szCs w:val="20"/>
-          <w:rtl w:val="0"/>
-        </w:rPr>
-        <w:t xml:space="preserve"> package installation, service configuration, database setup, and Node.js environment management.</w:t>
-      </w:r>
-      <w:r>
-        <w:rPr>
-          <w:rtl w:val="0"/>
-        </w:rPr>
-      </w:r>
-    </w:p>
-    <w:p>
-      <w:pPr>
-        <w:widowControl w:val="0"/>
-        <w:numPr>
-          <w:ilvl w:val="0"/>
-          <w:numId w:val="1"/>
-        </w:numPr>
-        <w:tabs>
-          <w:tab w:val="right" w:leader="none" w:pos="11088"/>
-          <w:tab w:val="right" w:leader="none" w:pos="11232"/>
-          <w:tab w:val="right" w:leader="none" w:pos="11430"/>
-        </w:tabs>
-        <w:spacing w:after="0" w:line="252.00000000000003" w:lineRule="auto"/>
-        <w:ind w:left="720" w:hanging="360"/>
-        <w:rPr>
-          <w:sz w:val="20"/>
-          <w:szCs w:val="20"/>
-          <w:u w:val="none"/>
-        </w:rPr>
-      </w:pPr>
-      <w:r>
-        <w:rPr>
-          <w:sz w:val="20"/>
-          <w:szCs w:val="20"/>
-          <w:rtl w:val="0"/>
-        </w:rPr>
-        <w:t xml:space="preserve">Designed modular, idempotent scripts for repeatable and reliable </w:t>
-      </w:r>
-      <w:r>
-        <w:rPr>
-          <w:b w:val="1"/>
-          <w:bCs w:val="1"/>
-          <w:sz w:val="20"/>
-          <w:szCs w:val="20"/>
-          <w:rtl w:val="0"/>
-        </w:rPr>
-        <w:t xml:space="preserve">system setup</w:t>
-      </w:r>
-      <w:r>
-        <w:rPr>
-          <w:sz w:val="20"/>
-          <w:szCs w:val="20"/>
-          <w:rtl w:val="0"/>
-        </w:rPr>
-        <w:t xml:space="preserve">.</w:t>
+        <w:t xml:space="preserve">mobile first</w:t>
+      </w:r>
+      <w:r>
+        <w:rPr>
+          <w:sz w:val="20"/>
+          <w:szCs w:val="20"/>
+          <w:rtl w:val="0"/>
+        </w:rPr>
+        <w:t xml:space="preserve"> layouts to ensure seamless performance across devices and </w:t>
+      </w:r>
+      <w:r>
+        <w:rPr>
+          <w:b w:val="1"/>
+          <w:bCs w:val="1"/>
+          <w:sz w:val="20"/>
+          <w:szCs w:val="20"/>
+          <w:rtl w:val="0"/>
+        </w:rPr>
+        <w:t xml:space="preserve">Collaborated</w:t>
+      </w:r>
+      <w:r>
+        <w:rPr>
+          <w:sz w:val="20"/>
+          <w:szCs w:val="20"/>
+          <w:rtl w:val="0"/>
+        </w:rPr>
+        <w:t xml:space="preserve"> with the client to translate creative requirements into functional UI, iterating based on feedback to deliver a polished final product.</w:t>
       </w:r>
       <w:r>
         <w:rPr>
@@ -1803,7 +1698,15 @@
           <w:szCs w:val="20"/>
           <w:rtl w:val="0"/>
         </w:rPr>
-        <w:t xml:space="preserve">Iqra University </w:t>
+        <w:t xml:space="preserve">Iqra University - </w:t>
+      </w:r>
+      <w:r>
+        <w:rPr>
+          <w:sz w:val="20"/>
+          <w:szCs w:val="20"/>
+          <w:rtl w:val="0"/>
+        </w:rPr>
+        <w:t xml:space="preserve">CGPA: 3.7</w:t>
       </w:r>
       <w:r>
         <w:rPr>
@@ -1849,34 +1752,12 @@
         <w:t xml:space="preserve">Bachelors in Computer Science</w:t>
       </w:r>
     </w:p>
-    <w:p>
-      <w:pPr>
-        <w:widowControl w:val="0"/>
-        <w:tabs>
-          <w:tab w:val="right" w:leader="none" w:pos="11088"/>
-          <w:tab w:val="right" w:leader="none" w:pos="11430"/>
-        </w:tabs>
-        <w:spacing w:before="0" w:line="252.00000000000003" w:lineRule="auto"/>
-        <w:rPr>
-          <w:sz w:val="20"/>
-          <w:szCs w:val="20"/>
-        </w:rPr>
-      </w:pPr>
-      <w:r>
-        <w:rPr>
-          <w:sz w:val="20"/>
-          <w:szCs w:val="20"/>
-          <w:rtl w:val="0"/>
-        </w:rPr>
-        <w:t xml:space="preserve">CGPA: 3.7</w:t>
-      </w:r>
-    </w:p>
     <w:sectPr>
-      <w:headerReference r:id="rId14" w:type="first"/>
-      <w:headerReference r:id="rId15" w:type="even"/>
-      <w:footerReference r:id="rId16" w:type="default"/>
-      <w:footerReference r:id="rId17" w:type="first"/>
-      <w:footerReference r:id="rId18" w:type="even"/>
+      <w:headerReference r:id="rId12" w:type="first"/>
+      <w:headerReference r:id="rId13" w:type="even"/>
+      <w:footerReference r:id="rId14" w:type="default"/>
+      <w:footerReference r:id="rId15" w:type="first"/>
+      <w:footerReference r:id="rId16" w:type="even"/>
       <w:pgSz w:h="15840" w:w="12240" w:orient="portrait"/>
       <w:pgMar w:bottom="432" w:top="432" w:left="576" w:right="576" w:header="14" w:footer="14"/>
       <w:pgNumType w:start="1"/>
@@ -2260,116 +2141,6 @@
         <w:ind w:left="720" w:hanging="360"/>
       </w:pPr>
       <w:rPr>
-        <w:u w:val="none"/>
-      </w:rPr>
-    </w:lvl>
-    <w:lvl w:ilvl="1">
-      <w:start w:val="1"/>
-      <w:numFmt w:val="bullet"/>
-      <w:lvlText w:val="○"/>
-      <w:lvlJc w:val="left"/>
-      <w:pPr>
-        <w:ind w:left="1440" w:hanging="360"/>
-      </w:pPr>
-      <w:rPr>
-        <w:u w:val="none"/>
-      </w:rPr>
-    </w:lvl>
-    <w:lvl w:ilvl="2">
-      <w:start w:val="1"/>
-      <w:numFmt w:val="bullet"/>
-      <w:lvlText w:val="■"/>
-      <w:lvlJc w:val="left"/>
-      <w:pPr>
-        <w:ind w:left="2160" w:hanging="360"/>
-      </w:pPr>
-      <w:rPr>
-        <w:u w:val="none"/>
-      </w:rPr>
-    </w:lvl>
-    <w:lvl w:ilvl="3">
-      <w:start w:val="1"/>
-      <w:numFmt w:val="bullet"/>
-      <w:lvlText w:val="●"/>
-      <w:lvlJc w:val="left"/>
-      <w:pPr>
-        <w:ind w:left="2880" w:hanging="360"/>
-      </w:pPr>
-      <w:rPr>
-        <w:u w:val="none"/>
-      </w:rPr>
-    </w:lvl>
-    <w:lvl w:ilvl="4">
-      <w:start w:val="1"/>
-      <w:numFmt w:val="bullet"/>
-      <w:lvlText w:val="○"/>
-      <w:lvlJc w:val="left"/>
-      <w:pPr>
-        <w:ind w:left="3600" w:hanging="360"/>
-      </w:pPr>
-      <w:rPr>
-        <w:u w:val="none"/>
-      </w:rPr>
-    </w:lvl>
-    <w:lvl w:ilvl="5">
-      <w:start w:val="1"/>
-      <w:numFmt w:val="bullet"/>
-      <w:lvlText w:val="■"/>
-      <w:lvlJc w:val="left"/>
-      <w:pPr>
-        <w:ind w:left="4320" w:hanging="360"/>
-      </w:pPr>
-      <w:rPr>
-        <w:u w:val="none"/>
-      </w:rPr>
-    </w:lvl>
-    <w:lvl w:ilvl="6">
-      <w:start w:val="1"/>
-      <w:numFmt w:val="bullet"/>
-      <w:lvlText w:val="●"/>
-      <w:lvlJc w:val="left"/>
-      <w:pPr>
-        <w:ind w:left="5040" w:hanging="360"/>
-      </w:pPr>
-      <w:rPr>
-        <w:u w:val="none"/>
-      </w:rPr>
-    </w:lvl>
-    <w:lvl w:ilvl="7">
-      <w:start w:val="1"/>
-      <w:numFmt w:val="bullet"/>
-      <w:lvlText w:val="○"/>
-      <w:lvlJc w:val="left"/>
-      <w:pPr>
-        <w:ind w:left="5760" w:hanging="360"/>
-      </w:pPr>
-      <w:rPr>
-        <w:u w:val="none"/>
-      </w:rPr>
-    </w:lvl>
-    <w:lvl w:ilvl="8">
-      <w:start w:val="1"/>
-      <w:numFmt w:val="bullet"/>
-      <w:lvlText w:val="■"/>
-      <w:lvlJc w:val="left"/>
-      <w:pPr>
-        <w:ind w:left="6480" w:hanging="360"/>
-      </w:pPr>
-      <w:rPr>
-        <w:u w:val="none"/>
-      </w:rPr>
-    </w:lvl>
-  </w:abstractNum>
-  <w:abstractNum w:abstractNumId="4">
-    <w:lvl w:ilvl="0">
-      <w:start w:val="1"/>
-      <w:numFmt w:val="bullet"/>
-      <w:lvlText w:val="●"/>
-      <w:lvlJc w:val="left"/>
-      <w:pPr>
-        <w:ind w:left="720" w:hanging="360"/>
-      </w:pPr>
-      <w:rPr>
         <w:rFonts w:ascii="Noto Sans Symbols" w:cs="Noto Sans Symbols" w:eastAsia="Noto Sans Symbols" w:hAnsi="Noto Sans Symbols"/>
         <w:sz w:val="20"/>
         <w:szCs w:val="20"/>
@@ -2496,9 +2267,6 @@
   </w:num>
   <w:num w:numId="3">
     <w:abstractNumId w:val="3"/>
-  </w:num>
-  <w:num w:numId="4">
-    <w:abstractNumId w:val="4"/>
   </w:num>
 </w:numbering>
 </file>
@@ -2636,20 +2404,6 @@
       <w:sz w:val="56"/>
       <w:szCs w:val="56"/>
     </w:rPr>
-  </w:style>
-  <w:style w:type="table" w:styleId="TableNormal" w:default="1">
-    <w:name w:val="TableNormal"/>
-    <w:tblPr>
-      <w:tblCellMar>
-        <w:top w:w="100.0" w:type="dxa"/>
-        <w:left w:w="100.0" w:type="dxa"/>
-        <w:bottom w:w="100.0" w:type="dxa"/>
-        <w:right w:w="100.0" w:type="dxa"/>
-      </w:tblCellMar>
-    </w:tblPr>
-  </w:style>
-  <w:style w:type="paragraph" w:styleId="Normal" w:default="1">
-    <w:name w:val="normal"/>
   </w:style>
   <w:style w:type="paragraph" w:styleId="Subtitle">
     <w:name w:val="Subtitle"/>
@@ -2983,19 +2737,4 @@
   </a:objectDefaults>
   <a:extraClrSchemeLst/>
 </a:theme>
-</file>
-
-<file path=customXML/item1.xml><?xml version="1.0" encoding="utf-8"?>
-<go:gDocsCustomXmlDataStorage xmlns:go="http://customooxmlschemas.google.com/" xmlns:r="http://schemas.openxmlformats.org/officeDocument/2006/relationships" uri="GoogleDocsCustomDataVersion2">
-  <go:docsCustomData xmlns:go="http://customooxmlschemas.google.com/" roundtripDataSignature="AMtx7mjfCr23K6ZKxgYgDJZsI5G8EJK+LA==">CgMxLjA4AHIhMVY2RC1TLUlrYmFQN00yUW81Qlg4X1dvOTB2Q3BCWUF2</go:docsCustomData>
-</go:gDocsCustomXmlDataStorage>
-</file>
-
-<file path=customXML/itemProps1.xml><?xml version="1.0" encoding="utf-8"?>
-<ds:datastoreItem xmlns:ds="http://schemas.openxmlformats.org/officeDocument/2006/customXml" ds:itemID="{11111111-1234-1234-1234-123412341234}">
-  <ds:schemaRefs>
-    <ds:schemaRef ds:uri="http://schemas.openxmlformats.org/officeDocument/2006/relationships"/>
-    <ds:schemaRef ds:uri="http://customooxmlschemas.google.com/"/>
-  </ds:schemaRefs>
-</ds:datastoreItem>
 </file>
</xml_diff>